<commit_message>
Updated the HTML page, made it neater added spacing, Added Variables and function to the JS page which will gather information put into the form. Added screenshot of the page to the JS validation docx
</commit_message>
<xml_diff>
--- a/PM-04/pm04-final-project/evidence/JavaScriptValidation.docx
+++ b/PM-04/pm04-final-project/evidence/JavaScriptValidation.docx
@@ -37,6 +37,62 @@
                     <a:xfrm>
                       <a:off x="0" y="0"/>
                       <a:ext cx="5731510" cy="2735580"/>
+                    </a:xfrm>
+                    <a:prstGeom prst="rect">
+                      <a:avLst/>
+                    </a:prstGeom>
+                  </pic:spPr>
+                </pic:pic>
+              </a:graphicData>
+            </a:graphic>
+          </wp:inline>
+        </w:drawing>
+      </w:r>
+    </w:p>
+    <w:p/>
+    <w:p>
+      <w:r>
+        <w:t xml:space="preserve">Added function logic to stop a page refreshing after submit button is pressed, and added variables to my JS to allow to capture data into an array and set </w:t>
+      </w:r>
+      <w:proofErr w:type="spellStart"/>
+      <w:r>
+        <w:t>const</w:t>
+      </w:r>
+      <w:proofErr w:type="spellEnd"/>
+      <w:r>
+        <w:t xml:space="preserve"> variables</w:t>
+      </w:r>
+    </w:p>
+    <w:p>
+      <w:r>
+        <w:rPr>
+          <w:noProof/>
+        </w:rPr>
+        <w:drawing>
+          <wp:inline distT="0" distB="0" distL="0" distR="0" wp14:anchorId="1090E331" wp14:editId="0C7A9B80">
+            <wp:extent cx="5731510" cy="2522855"/>
+            <wp:effectExtent l="0" t="0" r="2540" b="0"/>
+            <wp:docPr id="1026762232" name="Picture 1"/>
+            <wp:cNvGraphicFramePr>
+              <a:graphicFrameLocks xmlns:a="http://schemas.openxmlformats.org/drawingml/2006/main" noChangeAspect="1"/>
+            </wp:cNvGraphicFramePr>
+            <a:graphic xmlns:a="http://schemas.openxmlformats.org/drawingml/2006/main">
+              <a:graphicData uri="http://schemas.openxmlformats.org/drawingml/2006/picture">
+                <pic:pic xmlns:pic="http://schemas.openxmlformats.org/drawingml/2006/picture">
+                  <pic:nvPicPr>
+                    <pic:cNvPr id="1026762232" name=""/>
+                    <pic:cNvPicPr/>
+                  </pic:nvPicPr>
+                  <pic:blipFill>
+                    <a:blip r:embed="rId5"/>
+                    <a:stretch>
+                      <a:fillRect/>
+                    </a:stretch>
+                  </pic:blipFill>
+                  <pic:spPr>
+                    <a:xfrm>
+                      <a:off x="0" y="0"/>
+                      <a:ext cx="5731510" cy="2522855"/>
                     </a:xfrm>
                     <a:prstGeom prst="rect">
                       <a:avLst/>

</xml_diff>

<commit_message>
Fixed undefined JS error relating to the error on the console logging for summarising the user name, added testing evidence to JS valiation docx
</commit_message>
<xml_diff>
--- a/PM-04/pm04-final-project/evidence/JavaScriptValidation.docx
+++ b/PM-04/pm04-final-project/evidence/JavaScriptValidation.docx
@@ -28,7 +28,7 @@
                     <pic:cNvPicPr/>
                   </pic:nvPicPr>
                   <pic:blipFill>
-                    <a:blip r:embed="rId4"/>
+                    <a:blip r:embed="rId5"/>
                     <a:stretch>
                       <a:fillRect/>
                     </a:stretch>
@@ -84,7 +84,7 @@
                     <pic:cNvPicPr/>
                   </pic:nvPicPr>
                   <pic:blipFill>
-                    <a:blip r:embed="rId5"/>
+                    <a:blip r:embed="rId6"/>
                     <a:stretch>
                       <a:fillRect/>
                     </a:stretch>
@@ -105,6 +105,191 @@
         </w:drawing>
       </w:r>
     </w:p>
+    <w:p>
+      <w:r>
+        <w:t>Updated the HTML and added functions to the JS to return the output of user input:</w:t>
+      </w:r>
+    </w:p>
+    <w:p>
+      <w:pPr>
+        <w:pStyle w:val="ListParagraph"/>
+        <w:numPr>
+          <w:ilvl w:val="0"/>
+          <w:numId w:val="1"/>
+        </w:numPr>
+      </w:pPr>
+      <w:r>
+        <w:t>Page loads and additional div showing as expected</w:t>
+      </w:r>
+    </w:p>
+    <w:p>
+      <w:pPr>
+        <w:pStyle w:val="ListParagraph"/>
+      </w:pPr>
+      <w:r>
+        <w:rPr>
+          <w:noProof/>
+        </w:rPr>
+        <w:lastRenderedPageBreak/>
+        <w:drawing>
+          <wp:inline distT="0" distB="0" distL="0" distR="0" wp14:anchorId="7741AACF" wp14:editId="06D1F890">
+            <wp:extent cx="5731510" cy="3166745"/>
+            <wp:effectExtent l="0" t="0" r="2540" b="0"/>
+            <wp:docPr id="1950546328" name="Picture 1"/>
+            <wp:cNvGraphicFramePr>
+              <a:graphicFrameLocks xmlns:a="http://schemas.openxmlformats.org/drawingml/2006/main" noChangeAspect="1"/>
+            </wp:cNvGraphicFramePr>
+            <a:graphic xmlns:a="http://schemas.openxmlformats.org/drawingml/2006/main">
+              <a:graphicData uri="http://schemas.openxmlformats.org/drawingml/2006/picture">
+                <pic:pic xmlns:pic="http://schemas.openxmlformats.org/drawingml/2006/picture">
+                  <pic:nvPicPr>
+                    <pic:cNvPr id="1950546328" name=""/>
+                    <pic:cNvPicPr/>
+                  </pic:nvPicPr>
+                  <pic:blipFill>
+                    <a:blip r:embed="rId7"/>
+                    <a:stretch>
+                      <a:fillRect/>
+                    </a:stretch>
+                  </pic:blipFill>
+                  <pic:spPr>
+                    <a:xfrm>
+                      <a:off x="0" y="0"/>
+                      <a:ext cx="5731510" cy="3166745"/>
+                    </a:xfrm>
+                    <a:prstGeom prst="rect">
+                      <a:avLst/>
+                    </a:prstGeom>
+                  </pic:spPr>
+                </pic:pic>
+              </a:graphicData>
+            </a:graphic>
+          </wp:inline>
+        </w:drawing>
+      </w:r>
+    </w:p>
+    <w:p>
+      <w:pPr>
+        <w:pStyle w:val="ListParagraph"/>
+      </w:pPr>
+    </w:p>
+    <w:p>
+      <w:pPr>
+        <w:pStyle w:val="ListParagraph"/>
+        <w:numPr>
+          <w:ilvl w:val="0"/>
+          <w:numId w:val="1"/>
+        </w:numPr>
+      </w:pPr>
+      <w:r>
+        <w:t>User entered details and clicks on the submit button, alert pops up and console log shows the submit button clicked</w:t>
+      </w:r>
+    </w:p>
+    <w:p>
+      <w:r>
+        <w:rPr>
+          <w:noProof/>
+        </w:rPr>
+        <w:drawing>
+          <wp:inline distT="0" distB="0" distL="0" distR="0" wp14:anchorId="333C78C3" wp14:editId="43292B7A">
+            <wp:extent cx="5731510" cy="3202305"/>
+            <wp:effectExtent l="0" t="0" r="2540" b="0"/>
+            <wp:docPr id="1421637037" name="Picture 1"/>
+            <wp:cNvGraphicFramePr>
+              <a:graphicFrameLocks xmlns:a="http://schemas.openxmlformats.org/drawingml/2006/main" noChangeAspect="1"/>
+            </wp:cNvGraphicFramePr>
+            <a:graphic xmlns:a="http://schemas.openxmlformats.org/drawingml/2006/main">
+              <a:graphicData uri="http://schemas.openxmlformats.org/drawingml/2006/picture">
+                <pic:pic xmlns:pic="http://schemas.openxmlformats.org/drawingml/2006/picture">
+                  <pic:nvPicPr>
+                    <pic:cNvPr id="1421637037" name=""/>
+                    <pic:cNvPicPr/>
+                  </pic:nvPicPr>
+                  <pic:blipFill>
+                    <a:blip r:embed="rId8"/>
+                    <a:stretch>
+                      <a:fillRect/>
+                    </a:stretch>
+                  </pic:blipFill>
+                  <pic:spPr>
+                    <a:xfrm>
+                      <a:off x="0" y="0"/>
+                      <a:ext cx="5731510" cy="3202305"/>
+                    </a:xfrm>
+                    <a:prstGeom prst="rect">
+                      <a:avLst/>
+                    </a:prstGeom>
+                  </pic:spPr>
+                </pic:pic>
+              </a:graphicData>
+            </a:graphic>
+          </wp:inline>
+        </w:drawing>
+      </w:r>
+    </w:p>
+    <w:p>
+      <w:pPr>
+        <w:pStyle w:val="ListParagraph"/>
+        <w:numPr>
+          <w:ilvl w:val="0"/>
+          <w:numId w:val="1"/>
+        </w:numPr>
+      </w:pPr>
+      <w:r>
+        <w:t xml:space="preserve">After clicking the OK button, the Request output shows however I have </w:t>
+      </w:r>
+      <w:proofErr w:type="gramStart"/>
+      <w:r>
+        <w:t>a</w:t>
+      </w:r>
+      <w:proofErr w:type="gramEnd"/>
+      <w:r>
+        <w:t xml:space="preserve"> undefined error coming from my JS in my console log</w:t>
+      </w:r>
+    </w:p>
+    <w:p>
+      <w:r>
+        <w:rPr>
+          <w:noProof/>
+        </w:rPr>
+        <w:lastRenderedPageBreak/>
+        <w:drawing>
+          <wp:inline distT="0" distB="0" distL="0" distR="0" wp14:anchorId="71011201" wp14:editId="03E0BFFB">
+            <wp:extent cx="5731510" cy="3496945"/>
+            <wp:effectExtent l="0" t="0" r="2540" b="8255"/>
+            <wp:docPr id="1309888278" name="Picture 1"/>
+            <wp:cNvGraphicFramePr>
+              <a:graphicFrameLocks xmlns:a="http://schemas.openxmlformats.org/drawingml/2006/main" noChangeAspect="1"/>
+            </wp:cNvGraphicFramePr>
+            <a:graphic xmlns:a="http://schemas.openxmlformats.org/drawingml/2006/main">
+              <a:graphicData uri="http://schemas.openxmlformats.org/drawingml/2006/picture">
+                <pic:pic xmlns:pic="http://schemas.openxmlformats.org/drawingml/2006/picture">
+                  <pic:nvPicPr>
+                    <pic:cNvPr id="1309888278" name=""/>
+                    <pic:cNvPicPr/>
+                  </pic:nvPicPr>
+                  <pic:blipFill>
+                    <a:blip r:embed="rId9"/>
+                    <a:stretch>
+                      <a:fillRect/>
+                    </a:stretch>
+                  </pic:blipFill>
+                  <pic:spPr>
+                    <a:xfrm>
+                      <a:off x="0" y="0"/>
+                      <a:ext cx="5731510" cy="3496945"/>
+                    </a:xfrm>
+                    <a:prstGeom prst="rect">
+                      <a:avLst/>
+                    </a:prstGeom>
+                  </pic:spPr>
+                </pic:pic>
+              </a:graphicData>
+            </a:graphic>
+          </wp:inline>
+        </w:drawing>
+      </w:r>
+    </w:p>
     <w:sectPr>
       <w:pgSz w:w="11906" w:h="16838"/>
       <w:pgMar w:top="1440" w:right="1440" w:bottom="1440" w:left="1440" w:header="708" w:footer="708" w:gutter="0"/>
@@ -113,6 +298,103 @@
     </w:sectPr>
   </w:body>
 </w:document>
+</file>
+
+<file path=word/numbering.xml><?xml version="1.0" encoding="utf-8"?>
+<w:numbering xmlns:wpc="http://schemas.microsoft.com/office/word/2010/wordprocessingCanvas" xmlns:cx="http://schemas.microsoft.com/office/drawing/2014/chartex" xmlns:cx1="http://schemas.microsoft.com/office/drawing/2015/9/8/chartex" xmlns:cx2="http://schemas.microsoft.com/office/drawing/2015/10/21/chartex" xmlns:cx3="http://schemas.microsoft.com/office/drawing/2016/5/9/chartex" xmlns:cx4="http://schemas.microsoft.com/office/drawing/2016/5/10/chartex" xmlns:cx5="http://schemas.microsoft.com/office/drawing/2016/5/11/chartex" xmlns:cx6="http://schemas.microsoft.com/office/drawing/2016/5/12/chartex" xmlns:cx7="http://schemas.microsoft.com/office/drawing/2016/5/13/chartex" xmlns:cx8="http://schemas.microsoft.com/office/drawing/2016/5/14/chartex" xmlns:mc="http://schemas.openxmlformats.org/markup-compatibility/2006" xmlns:aink="http://schemas.microsoft.com/office/drawing/2016/ink" xmlns:am3d="http://schemas.microsoft.com/office/drawing/2017/model3d" xmlns:o="urn:schemas-microsoft-com:office:office" xmlns:oel="http://schemas.microsoft.com/office/2019/extlst" xmlns:r="http://schemas.openxmlformats.org/officeDocument/2006/relationships" xmlns:m="http://schemas.openxmlformats.org/officeDocument/2006/math" xmlns:v="urn:schemas-microsoft-com:vml" xmlns:wp14="http://schemas.microsoft.com/office/word/2010/wordprocessingDrawing" xmlns:wp="http://schemas.openxmlformats.org/drawingml/2006/wordprocessingDrawing" xmlns:w10="urn:schemas-microsoft-com:office:word" xmlns:w="http://schemas.openxmlformats.org/wordprocessingml/2006/main" xmlns:w14="http://schemas.microsoft.com/office/word/2010/wordml" xmlns:w15="http://schemas.microsoft.com/office/word/2012/wordml" xmlns:w16cex="http://schemas.microsoft.com/office/word/2018/wordml/cex" xmlns:w16cid="http://schemas.microsoft.com/office/word/2016/wordml/cid" xmlns:w16="http://schemas.microsoft.com/office/word/2018/wordml" xmlns:w16du="http://schemas.microsoft.com/office/word/2023/wordml/word16du" xmlns:w16sdtdh="http://schemas.microsoft.com/office/word/2020/wordml/sdtdatahash" xmlns:w16sdtfl="http://schemas.microsoft.com/office/word/2024/wordml/sdtformatlock" xmlns:w16se="http://schemas.microsoft.com/office/word/2015/wordml/symex" xmlns:wpg="http://schemas.microsoft.com/office/word/2010/wordprocessingGroup" xmlns:wpi="http://schemas.microsoft.com/office/word/2010/wordprocessingInk" xmlns:wne="http://schemas.microsoft.com/office/word/2006/wordml" xmlns:wps="http://schemas.microsoft.com/office/word/2010/wordprocessingShape" mc:Ignorable="w14 w15 w16se w16cid w16 w16cex w16sdtdh w16sdtfl w16du wp14">
+  <w:abstractNum w:abstractNumId="0" w15:restartNumberingAfterBreak="0">
+    <w:nsid w:val="66D43331"/>
+    <w:multiLevelType w:val="hybridMultilevel"/>
+    <w:tmpl w:val="E96C6DFE"/>
+    <w:lvl w:ilvl="0" w:tplc="1C09000F">
+      <w:start w:val="1"/>
+      <w:numFmt w:val="decimal"/>
+      <w:lvlText w:val="%1."/>
+      <w:lvlJc w:val="left"/>
+      <w:pPr>
+        <w:ind w:left="720" w:hanging="360"/>
+      </w:pPr>
+      <w:rPr>
+        <w:rFonts w:hint="default"/>
+      </w:rPr>
+    </w:lvl>
+    <w:lvl w:ilvl="1" w:tplc="1C090019" w:tentative="1">
+      <w:start w:val="1"/>
+      <w:numFmt w:val="lowerLetter"/>
+      <w:lvlText w:val="%2."/>
+      <w:lvlJc w:val="left"/>
+      <w:pPr>
+        <w:ind w:left="1440" w:hanging="360"/>
+      </w:pPr>
+    </w:lvl>
+    <w:lvl w:ilvl="2" w:tplc="1C09001B" w:tentative="1">
+      <w:start w:val="1"/>
+      <w:numFmt w:val="lowerRoman"/>
+      <w:lvlText w:val="%3."/>
+      <w:lvlJc w:val="right"/>
+      <w:pPr>
+        <w:ind w:left="2160" w:hanging="180"/>
+      </w:pPr>
+    </w:lvl>
+    <w:lvl w:ilvl="3" w:tplc="1C09000F" w:tentative="1">
+      <w:start w:val="1"/>
+      <w:numFmt w:val="decimal"/>
+      <w:lvlText w:val="%4."/>
+      <w:lvlJc w:val="left"/>
+      <w:pPr>
+        <w:ind w:left="2880" w:hanging="360"/>
+      </w:pPr>
+    </w:lvl>
+    <w:lvl w:ilvl="4" w:tplc="1C090019" w:tentative="1">
+      <w:start w:val="1"/>
+      <w:numFmt w:val="lowerLetter"/>
+      <w:lvlText w:val="%5."/>
+      <w:lvlJc w:val="left"/>
+      <w:pPr>
+        <w:ind w:left="3600" w:hanging="360"/>
+      </w:pPr>
+    </w:lvl>
+    <w:lvl w:ilvl="5" w:tplc="1C09001B" w:tentative="1">
+      <w:start w:val="1"/>
+      <w:numFmt w:val="lowerRoman"/>
+      <w:lvlText w:val="%6."/>
+      <w:lvlJc w:val="right"/>
+      <w:pPr>
+        <w:ind w:left="4320" w:hanging="180"/>
+      </w:pPr>
+    </w:lvl>
+    <w:lvl w:ilvl="6" w:tplc="1C09000F" w:tentative="1">
+      <w:start w:val="1"/>
+      <w:numFmt w:val="decimal"/>
+      <w:lvlText w:val="%7."/>
+      <w:lvlJc w:val="left"/>
+      <w:pPr>
+        <w:ind w:left="5040" w:hanging="360"/>
+      </w:pPr>
+    </w:lvl>
+    <w:lvl w:ilvl="7" w:tplc="1C090019" w:tentative="1">
+      <w:start w:val="1"/>
+      <w:numFmt w:val="lowerLetter"/>
+      <w:lvlText w:val="%8."/>
+      <w:lvlJc w:val="left"/>
+      <w:pPr>
+        <w:ind w:left="5760" w:hanging="360"/>
+      </w:pPr>
+    </w:lvl>
+    <w:lvl w:ilvl="8" w:tplc="1C09001B" w:tentative="1">
+      <w:start w:val="1"/>
+      <w:numFmt w:val="lowerRoman"/>
+      <w:lvlText w:val="%9."/>
+      <w:lvlJc w:val="right"/>
+      <w:pPr>
+        <w:ind w:left="6480" w:hanging="180"/>
+      </w:pPr>
+    </w:lvl>
+  </w:abstractNum>
+  <w:num w:numId="1" w16cid:durableId="1504978265">
+    <w:abstractNumId w:val="0"/>
+  </w:num>
+</w:numbering>
 </file>
 
 <file path=word/styles.xml><?xml version="1.0" encoding="utf-8"?>

</xml_diff>

<commit_message>
Added functionality for capturing the priority level of the user's choice
</commit_message>
<xml_diff>
--- a/PM-04/pm04-final-project/evidence/JavaScriptValidation.docx
+++ b/PM-04/pm04-final-project/evidence/JavaScriptValidation.docx
@@ -1,6 +1,6 @@
 
 <file path=word/document.xml><?xml version="1.0" encoding="utf-8"?>
-<w:document xmlns:wpc="http://schemas.microsoft.com/office/word/2010/wordprocessingCanvas" xmlns:cx="http://schemas.microsoft.com/office/drawing/2014/chartex" xmlns:cx1="http://schemas.microsoft.com/office/drawing/2015/9/8/chartex" xmlns:cx2="http://schemas.microsoft.com/office/drawing/2015/10/21/chartex" xmlns:cx3="http://schemas.microsoft.com/office/drawing/2016/5/9/chartex" xmlns:cx4="http://schemas.microsoft.com/office/drawing/2016/5/10/chartex" xmlns:cx5="http://schemas.microsoft.com/office/drawing/2016/5/11/chartex" xmlns:cx6="http://schemas.microsoft.com/office/drawing/2016/5/12/chartex" xmlns:cx7="http://schemas.microsoft.com/office/drawing/2016/5/13/chartex" xmlns:cx8="http://schemas.microsoft.com/office/drawing/2016/5/14/chartex" xmlns:mc="http://schemas.openxmlformats.org/markup-compatibility/2006" xmlns:aink="http://schemas.microsoft.com/office/drawing/2016/ink" xmlns:am3d="http://schemas.microsoft.com/office/drawing/2017/model3d" xmlns:o="urn:schemas-microsoft-com:office:office" xmlns:oel="http://schemas.microsoft.com/office/2019/extlst" xmlns:r="http://schemas.openxmlformats.org/officeDocument/2006/relationships" xmlns:m="http://schemas.openxmlformats.org/officeDocument/2006/math" xmlns:v="urn:schemas-microsoft-com:vml" xmlns:wp14="http://schemas.microsoft.com/office/word/2010/wordprocessingDrawing" xmlns:wp="http://schemas.openxmlformats.org/drawingml/2006/wordprocessingDrawing" xmlns:w10="urn:schemas-microsoft-com:office:word" xmlns:w="http://schemas.openxmlformats.org/wordprocessingml/2006/main" xmlns:w14="http://schemas.microsoft.com/office/word/2010/wordml" xmlns:w15="http://schemas.microsoft.com/office/word/2012/wordml" xmlns:w16cex="http://schemas.microsoft.com/office/word/2018/wordml/cex" xmlns:w16cid="http://schemas.microsoft.com/office/word/2016/wordml/cid" xmlns:w16="http://schemas.microsoft.com/office/word/2018/wordml" xmlns:w16du="http://schemas.microsoft.com/office/word/2023/wordml/word16du" xmlns:w16sdtdh="http://schemas.microsoft.com/office/word/2020/wordml/sdtdatahash" xmlns:w16sdtfl="http://schemas.microsoft.com/office/word/2024/wordml/sdtformatlock" xmlns:w16se="http://schemas.microsoft.com/office/word/2015/wordml/symex" xmlns:wpg="http://schemas.microsoft.com/office/word/2010/wordprocessingGroup" xmlns:wpi="http://schemas.microsoft.com/office/word/2010/wordprocessingInk" xmlns:wne="http://schemas.microsoft.com/office/word/2006/wordml" xmlns:wps="http://schemas.microsoft.com/office/word/2010/wordprocessingShape" mc:Ignorable="w14 w15 w16se w16cid w16 w16cex w16sdtdh w16sdtfl w16du wp14">
+<w:document xmlns:wpc="http://schemas.microsoft.com/office/word/2010/wordprocessingCanvas" xmlns:cx="http://schemas.microsoft.com/office/drawing/2014/chartex" xmlns:cx1="http://schemas.microsoft.com/office/drawing/2015/9/8/chartex" xmlns:cx2="http://schemas.microsoft.com/office/drawing/2015/10/21/chartex" xmlns:cx3="http://schemas.microsoft.com/office/drawing/2016/5/9/chartex" xmlns:cx4="http://schemas.microsoft.com/office/drawing/2016/5/10/chartex" xmlns:cx5="http://schemas.microsoft.com/office/drawing/2016/5/11/chartex" xmlns:cx6="http://schemas.microsoft.com/office/drawing/2016/5/12/chartex" xmlns:cx7="http://schemas.microsoft.com/office/drawing/2016/5/13/chartex" xmlns:cx8="http://schemas.microsoft.com/office/drawing/2016/5/14/chartex" xmlns:mc="http://schemas.openxmlformats.org/markup-compatibility/2006" xmlns:aink="http://schemas.microsoft.com/office/drawing/2016/ink" xmlns:am3d="http://schemas.microsoft.com/office/drawing/2017/model3d" xmlns:o="urn:schemas-microsoft-com:office:office" xmlns:oel="http://schemas.microsoft.com/office/2019/extlst" xmlns:r="http://schemas.openxmlformats.org/officeDocument/2006/relationships" xmlns:m="http://schemas.openxmlformats.org/officeDocument/2006/math" xmlns:v="urn:schemas-microsoft-com:vml" xmlns:wp14="http://schemas.microsoft.com/office/word/2010/wordprocessingDrawing" xmlns:wp="http://schemas.openxmlformats.org/drawingml/2006/wordprocessingDrawing" xmlns:w10="urn:schemas-microsoft-com:office:word" xmlns:w="http://schemas.openxmlformats.org/wordprocessingml/2006/main" xmlns:w14="http://schemas.microsoft.com/office/word/2010/wordml" xmlns:w15="http://schemas.microsoft.com/office/word/2012/wordml" xmlns:w16cei="http://schemas.microsoft.com/office/word/2026/wordml/cei" xmlns:w16cex="http://schemas.microsoft.com/office/word/2018/wordml/cex" xmlns:w16cid="http://schemas.microsoft.com/office/word/2016/wordml/cid" xmlns:w16="http://schemas.microsoft.com/office/word/2018/wordml" xmlns:w16du="http://schemas.microsoft.com/office/word/2023/wordml/word16du" xmlns:w16sdtdh="http://schemas.microsoft.com/office/word/2020/wordml/sdtdatahash" xmlns:w16sdtfl="http://schemas.microsoft.com/office/word/2024/wordml/sdtformatlock" xmlns:w16se="http://schemas.microsoft.com/office/word/2015/wordml/symex" xmlns:wpg="http://schemas.microsoft.com/office/word/2010/wordprocessingGroup" xmlns:wpi="http://schemas.microsoft.com/office/word/2010/wordprocessingInk" xmlns:wne="http://schemas.microsoft.com/office/word/2006/wordml" xmlns:wps="http://schemas.microsoft.com/office/word/2010/wordprocessingShape" mc:Ignorable="w14 w15 w16se w16cid w16 w16cex w16sdtdh w16sdtfl w16du wp14">
   <w:body>
     <w:p>
       <w:r>
@@ -290,6 +290,256 @@
         </w:drawing>
       </w:r>
     </w:p>
+    <w:p>
+      <w:r>
+        <w:t>Resolved the above error by correcting the request variable in JS</w:t>
+      </w:r>
+    </w:p>
+    <w:p>
+      <w:r>
+        <w:rPr>
+          <w:noProof/>
+        </w:rPr>
+        <w:drawing>
+          <wp:inline distT="0" distB="0" distL="0" distR="0" wp14:anchorId="702371FF" wp14:editId="28511E07">
+            <wp:extent cx="5731510" cy="1760855"/>
+            <wp:effectExtent l="0" t="0" r="2540" b="0"/>
+            <wp:docPr id="575035661" name="Picture 1"/>
+            <wp:cNvGraphicFramePr>
+              <a:graphicFrameLocks xmlns:a="http://schemas.openxmlformats.org/drawingml/2006/main" noChangeAspect="1"/>
+            </wp:cNvGraphicFramePr>
+            <a:graphic xmlns:a="http://schemas.openxmlformats.org/drawingml/2006/main">
+              <a:graphicData uri="http://schemas.openxmlformats.org/drawingml/2006/picture">
+                <pic:pic xmlns:pic="http://schemas.openxmlformats.org/drawingml/2006/picture">
+                  <pic:nvPicPr>
+                    <pic:cNvPr id="575035661" name=""/>
+                    <pic:cNvPicPr/>
+                  </pic:nvPicPr>
+                  <pic:blipFill>
+                    <a:blip r:embed="rId10"/>
+                    <a:stretch>
+                      <a:fillRect/>
+                    </a:stretch>
+                  </pic:blipFill>
+                  <pic:spPr>
+                    <a:xfrm>
+                      <a:off x="0" y="0"/>
+                      <a:ext cx="5731510" cy="1760855"/>
+                    </a:xfrm>
+                    <a:prstGeom prst="rect">
+                      <a:avLst/>
+                    </a:prstGeom>
+                  </pic:spPr>
+                </pic:pic>
+              </a:graphicData>
+            </a:graphic>
+          </wp:inline>
+        </w:drawing>
+      </w:r>
+    </w:p>
+    <w:p>
+      <w:r>
+        <w:t xml:space="preserve">Name is now displaying in the </w:t>
+      </w:r>
+      <w:proofErr w:type="gramStart"/>
+      <w:r>
+        <w:t>console.log(</w:t>
+      </w:r>
+      <w:proofErr w:type="gramEnd"/>
+      <w:r>
+        <w:t>)</w:t>
+      </w:r>
+    </w:p>
+    <w:p>
+      <w:r>
+        <w:rPr>
+          <w:noProof/>
+        </w:rPr>
+        <w:lastRenderedPageBreak/>
+        <w:drawing>
+          <wp:inline distT="0" distB="0" distL="0" distR="0" wp14:anchorId="23533DE9" wp14:editId="7F93B1C8">
+            <wp:extent cx="5731510" cy="2945765"/>
+            <wp:effectExtent l="0" t="0" r="2540" b="6985"/>
+            <wp:docPr id="966038496" name="Picture 1"/>
+            <wp:cNvGraphicFramePr>
+              <a:graphicFrameLocks xmlns:a="http://schemas.openxmlformats.org/drawingml/2006/main" noChangeAspect="1"/>
+            </wp:cNvGraphicFramePr>
+            <a:graphic xmlns:a="http://schemas.openxmlformats.org/drawingml/2006/main">
+              <a:graphicData uri="http://schemas.openxmlformats.org/drawingml/2006/picture">
+                <pic:pic xmlns:pic="http://schemas.openxmlformats.org/drawingml/2006/picture">
+                  <pic:nvPicPr>
+                    <pic:cNvPr id="966038496" name=""/>
+                    <pic:cNvPicPr/>
+                  </pic:nvPicPr>
+                  <pic:blipFill>
+                    <a:blip r:embed="rId11"/>
+                    <a:stretch>
+                      <a:fillRect/>
+                    </a:stretch>
+                  </pic:blipFill>
+                  <pic:spPr>
+                    <a:xfrm>
+                      <a:off x="0" y="0"/>
+                      <a:ext cx="5731510" cy="2945765"/>
+                    </a:xfrm>
+                    <a:prstGeom prst="rect">
+                      <a:avLst/>
+                    </a:prstGeom>
+                  </pic:spPr>
+                </pic:pic>
+              </a:graphicData>
+            </a:graphic>
+          </wp:inline>
+        </w:drawing>
+      </w:r>
+    </w:p>
+    <w:p/>
+    <w:p>
+      <w:r>
+        <w:t xml:space="preserve">Adding functionality for the Priority check to see what levels are being requested by the user via </w:t>
+      </w:r>
+      <w:proofErr w:type="gramStart"/>
+      <w:r>
+        <w:t>console.log(</w:t>
+      </w:r>
+      <w:proofErr w:type="gramEnd"/>
+      <w:r>
+        <w:t>)</w:t>
+      </w:r>
+    </w:p>
+    <w:p>
+      <w:r>
+        <w:rPr>
+          <w:noProof/>
+        </w:rPr>
+        <w:drawing>
+          <wp:inline distT="0" distB="0" distL="0" distR="0" wp14:anchorId="75D6C36F" wp14:editId="3BC1F75E">
+            <wp:extent cx="5731510" cy="2663825"/>
+            <wp:effectExtent l="0" t="0" r="2540" b="3175"/>
+            <wp:docPr id="438709397" name="Picture 1"/>
+            <wp:cNvGraphicFramePr>
+              <a:graphicFrameLocks xmlns:a="http://schemas.openxmlformats.org/drawingml/2006/main" noChangeAspect="1"/>
+            </wp:cNvGraphicFramePr>
+            <a:graphic xmlns:a="http://schemas.openxmlformats.org/drawingml/2006/main">
+              <a:graphicData uri="http://schemas.openxmlformats.org/drawingml/2006/picture">
+                <pic:pic xmlns:pic="http://schemas.openxmlformats.org/drawingml/2006/picture">
+                  <pic:nvPicPr>
+                    <pic:cNvPr id="438709397" name=""/>
+                    <pic:cNvPicPr/>
+                  </pic:nvPicPr>
+                  <pic:blipFill>
+                    <a:blip r:embed="rId12"/>
+                    <a:stretch>
+                      <a:fillRect/>
+                    </a:stretch>
+                  </pic:blipFill>
+                  <pic:spPr>
+                    <a:xfrm>
+                      <a:off x="0" y="0"/>
+                      <a:ext cx="5731510" cy="2663825"/>
+                    </a:xfrm>
+                    <a:prstGeom prst="rect">
+                      <a:avLst/>
+                    </a:prstGeom>
+                  </pic:spPr>
+                </pic:pic>
+              </a:graphicData>
+            </a:graphic>
+          </wp:inline>
+        </w:drawing>
+      </w:r>
+    </w:p>
+    <w:p>
+      <w:r>
+        <w:rPr>
+          <w:noProof/>
+        </w:rPr>
+        <w:drawing>
+          <wp:inline distT="0" distB="0" distL="0" distR="0" wp14:anchorId="7F7DFC28" wp14:editId="6331CFFB">
+            <wp:extent cx="5731510" cy="1619250"/>
+            <wp:effectExtent l="0" t="0" r="2540" b="0"/>
+            <wp:docPr id="106896921" name="Picture 1"/>
+            <wp:cNvGraphicFramePr>
+              <a:graphicFrameLocks xmlns:a="http://schemas.openxmlformats.org/drawingml/2006/main" noChangeAspect="1"/>
+            </wp:cNvGraphicFramePr>
+            <a:graphic xmlns:a="http://schemas.openxmlformats.org/drawingml/2006/main">
+              <a:graphicData uri="http://schemas.openxmlformats.org/drawingml/2006/picture">
+                <pic:pic xmlns:pic="http://schemas.openxmlformats.org/drawingml/2006/picture">
+                  <pic:nvPicPr>
+                    <pic:cNvPr id="106896921" name=""/>
+                    <pic:cNvPicPr/>
+                  </pic:nvPicPr>
+                  <pic:blipFill>
+                    <a:blip r:embed="rId13"/>
+                    <a:stretch>
+                      <a:fillRect/>
+                    </a:stretch>
+                  </pic:blipFill>
+                  <pic:spPr>
+                    <a:xfrm>
+                      <a:off x="0" y="0"/>
+                      <a:ext cx="5731510" cy="1619250"/>
+                    </a:xfrm>
+                    <a:prstGeom prst="rect">
+                      <a:avLst/>
+                    </a:prstGeom>
+                  </pic:spPr>
+                </pic:pic>
+              </a:graphicData>
+            </a:graphic>
+          </wp:inline>
+        </w:drawing>
+      </w:r>
+    </w:p>
+    <w:p/>
+    <w:p>
+      <w:r>
+        <w:lastRenderedPageBreak/>
+        <w:t xml:space="preserve">Tested however got an error: </w:t>
+      </w:r>
+    </w:p>
+    <w:p>
+      <w:r>
+        <w:rPr>
+          <w:noProof/>
+        </w:rPr>
+        <w:drawing>
+          <wp:inline distT="0" distB="0" distL="0" distR="0" wp14:anchorId="20146E77" wp14:editId="26B6EB1B">
+            <wp:extent cx="5731510" cy="2259330"/>
+            <wp:effectExtent l="0" t="0" r="2540" b="7620"/>
+            <wp:docPr id="885057259" name="Picture 1"/>
+            <wp:cNvGraphicFramePr>
+              <a:graphicFrameLocks xmlns:a="http://schemas.openxmlformats.org/drawingml/2006/main" noChangeAspect="1"/>
+            </wp:cNvGraphicFramePr>
+            <a:graphic xmlns:a="http://schemas.openxmlformats.org/drawingml/2006/main">
+              <a:graphicData uri="http://schemas.openxmlformats.org/drawingml/2006/picture">
+                <pic:pic xmlns:pic="http://schemas.openxmlformats.org/drawingml/2006/picture">
+                  <pic:nvPicPr>
+                    <pic:cNvPr id="885057259" name=""/>
+                    <pic:cNvPicPr/>
+                  </pic:nvPicPr>
+                  <pic:blipFill>
+                    <a:blip r:embed="rId14"/>
+                    <a:stretch>
+                      <a:fillRect/>
+                    </a:stretch>
+                  </pic:blipFill>
+                  <pic:spPr>
+                    <a:xfrm>
+                      <a:off x="0" y="0"/>
+                      <a:ext cx="5731510" cy="2259330"/>
+                    </a:xfrm>
+                    <a:prstGeom prst="rect">
+                      <a:avLst/>
+                    </a:prstGeom>
+                  </pic:spPr>
+                </pic:pic>
+              </a:graphicData>
+            </a:graphic>
+          </wp:inline>
+        </w:drawing>
+      </w:r>
+    </w:p>
     <w:sectPr>
       <w:pgSz w:w="11906" w:h="16838"/>
       <w:pgMar w:top="1440" w:right="1440" w:bottom="1440" w:left="1440" w:header="708" w:footer="708" w:gutter="0"/>
@@ -301,7 +551,7 @@
 </file>
 
 <file path=word/numbering.xml><?xml version="1.0" encoding="utf-8"?>
-<w:numbering xmlns:wpc="http://schemas.microsoft.com/office/word/2010/wordprocessingCanvas" xmlns:cx="http://schemas.microsoft.com/office/drawing/2014/chartex" xmlns:cx1="http://schemas.microsoft.com/office/drawing/2015/9/8/chartex" xmlns:cx2="http://schemas.microsoft.com/office/drawing/2015/10/21/chartex" xmlns:cx3="http://schemas.microsoft.com/office/drawing/2016/5/9/chartex" xmlns:cx4="http://schemas.microsoft.com/office/drawing/2016/5/10/chartex" xmlns:cx5="http://schemas.microsoft.com/office/drawing/2016/5/11/chartex" xmlns:cx6="http://schemas.microsoft.com/office/drawing/2016/5/12/chartex" xmlns:cx7="http://schemas.microsoft.com/office/drawing/2016/5/13/chartex" xmlns:cx8="http://schemas.microsoft.com/office/drawing/2016/5/14/chartex" xmlns:mc="http://schemas.openxmlformats.org/markup-compatibility/2006" xmlns:aink="http://schemas.microsoft.com/office/drawing/2016/ink" xmlns:am3d="http://schemas.microsoft.com/office/drawing/2017/model3d" xmlns:o="urn:schemas-microsoft-com:office:office" xmlns:oel="http://schemas.microsoft.com/office/2019/extlst" xmlns:r="http://schemas.openxmlformats.org/officeDocument/2006/relationships" xmlns:m="http://schemas.openxmlformats.org/officeDocument/2006/math" xmlns:v="urn:schemas-microsoft-com:vml" xmlns:wp14="http://schemas.microsoft.com/office/word/2010/wordprocessingDrawing" xmlns:wp="http://schemas.openxmlformats.org/drawingml/2006/wordprocessingDrawing" xmlns:w10="urn:schemas-microsoft-com:office:word" xmlns:w="http://schemas.openxmlformats.org/wordprocessingml/2006/main" xmlns:w14="http://schemas.microsoft.com/office/word/2010/wordml" xmlns:w15="http://schemas.microsoft.com/office/word/2012/wordml" xmlns:w16cex="http://schemas.microsoft.com/office/word/2018/wordml/cex" xmlns:w16cid="http://schemas.microsoft.com/office/word/2016/wordml/cid" xmlns:w16="http://schemas.microsoft.com/office/word/2018/wordml" xmlns:w16du="http://schemas.microsoft.com/office/word/2023/wordml/word16du" xmlns:w16sdtdh="http://schemas.microsoft.com/office/word/2020/wordml/sdtdatahash" xmlns:w16sdtfl="http://schemas.microsoft.com/office/word/2024/wordml/sdtformatlock" xmlns:w16se="http://schemas.microsoft.com/office/word/2015/wordml/symex" xmlns:wpg="http://schemas.microsoft.com/office/word/2010/wordprocessingGroup" xmlns:wpi="http://schemas.microsoft.com/office/word/2010/wordprocessingInk" xmlns:wne="http://schemas.microsoft.com/office/word/2006/wordml" xmlns:wps="http://schemas.microsoft.com/office/word/2010/wordprocessingShape" mc:Ignorable="w14 w15 w16se w16cid w16 w16cex w16sdtdh w16sdtfl w16du wp14">
+<w:numbering xmlns:wpc="http://schemas.microsoft.com/office/word/2010/wordprocessingCanvas" xmlns:cx="http://schemas.microsoft.com/office/drawing/2014/chartex" xmlns:cx1="http://schemas.microsoft.com/office/drawing/2015/9/8/chartex" xmlns:cx2="http://schemas.microsoft.com/office/drawing/2015/10/21/chartex" xmlns:cx3="http://schemas.microsoft.com/office/drawing/2016/5/9/chartex" xmlns:cx4="http://schemas.microsoft.com/office/drawing/2016/5/10/chartex" xmlns:cx5="http://schemas.microsoft.com/office/drawing/2016/5/11/chartex" xmlns:cx6="http://schemas.microsoft.com/office/drawing/2016/5/12/chartex" xmlns:cx7="http://schemas.microsoft.com/office/drawing/2016/5/13/chartex" xmlns:cx8="http://schemas.microsoft.com/office/drawing/2016/5/14/chartex" xmlns:mc="http://schemas.openxmlformats.org/markup-compatibility/2006" xmlns:aink="http://schemas.microsoft.com/office/drawing/2016/ink" xmlns:am3d="http://schemas.microsoft.com/office/drawing/2017/model3d" xmlns:o="urn:schemas-microsoft-com:office:office" xmlns:oel="http://schemas.microsoft.com/office/2019/extlst" xmlns:r="http://schemas.openxmlformats.org/officeDocument/2006/relationships" xmlns:m="http://schemas.openxmlformats.org/officeDocument/2006/math" xmlns:v="urn:schemas-microsoft-com:vml" xmlns:wp14="http://schemas.microsoft.com/office/word/2010/wordprocessingDrawing" xmlns:wp="http://schemas.openxmlformats.org/drawingml/2006/wordprocessingDrawing" xmlns:w10="urn:schemas-microsoft-com:office:word" xmlns:w="http://schemas.openxmlformats.org/wordprocessingml/2006/main" xmlns:w14="http://schemas.microsoft.com/office/word/2010/wordml" xmlns:w15="http://schemas.microsoft.com/office/word/2012/wordml" xmlns:w16cei="http://schemas.microsoft.com/office/word/2026/wordml/cei" xmlns:w16cex="http://schemas.microsoft.com/office/word/2018/wordml/cex" xmlns:w16cid="http://schemas.microsoft.com/office/word/2016/wordml/cid" xmlns:w16="http://schemas.microsoft.com/office/word/2018/wordml" xmlns:w16du="http://schemas.microsoft.com/office/word/2023/wordml/word16du" xmlns:w16sdtdh="http://schemas.microsoft.com/office/word/2020/wordml/sdtdatahash" xmlns:w16sdtfl="http://schemas.microsoft.com/office/word/2024/wordml/sdtformatlock" xmlns:w16se="http://schemas.microsoft.com/office/word/2015/wordml/symex" xmlns:wpg="http://schemas.microsoft.com/office/word/2010/wordprocessingGroup" xmlns:wpi="http://schemas.microsoft.com/office/word/2010/wordprocessingInk" xmlns:wne="http://schemas.microsoft.com/office/word/2006/wordml" xmlns:wps="http://schemas.microsoft.com/office/word/2010/wordprocessingShape" mc:Ignorable="w14 w15 w16se w16cid w16 w16cex w16sdtdh w16sdtfl w16du wp14">
   <w:abstractNum w:abstractNumId="0" w15:restartNumberingAfterBreak="0">
     <w:nsid w:val="66D43331"/>
     <w:multiLevelType w:val="hybridMultilevel"/>

</xml_diff>

<commit_message>
Removed input of parameters for the IF statement, Need to resolve the console.log being forced and have the IF statemennt work
</commit_message>
<xml_diff>
--- a/PM-04/pm04-final-project/evidence/JavaScriptValidation.docx
+++ b/PM-04/pm04-final-project/evidence/JavaScriptValidation.docx
@@ -52,15 +52,7 @@
     <w:p/>
     <w:p>
       <w:r>
-        <w:t xml:space="preserve">Added function logic to stop a page refreshing after submit button is pressed, and added variables to my JS to allow to capture data into an array and set </w:t>
-      </w:r>
-      <w:proofErr w:type="spellStart"/>
-      <w:r>
-        <w:t>const</w:t>
-      </w:r>
-      <w:proofErr w:type="spellEnd"/>
-      <w:r>
-        <w:t xml:space="preserve"> variables</w:t>
+        <w:t>Added function logic to stop a page refreshing after submit button is pressed, and added variables to my JS to allow to capture data into an array and set const variables</w:t>
       </w:r>
     </w:p>
     <w:p>
@@ -236,15 +228,7 @@
         </w:numPr>
       </w:pPr>
       <w:r>
-        <w:t xml:space="preserve">After clicking the OK button, the Request output shows however I have </w:t>
-      </w:r>
-      <w:proofErr w:type="gramStart"/>
-      <w:r>
-        <w:t>a</w:t>
-      </w:r>
-      <w:proofErr w:type="gramEnd"/>
-      <w:r>
-        <w:t xml:space="preserve"> undefined error coming from my JS in my console log</w:t>
+        <w:t>After clicking the OK button, the Request output shows however I have a undefined error coming from my JS in my console log</w:t>
       </w:r>
     </w:p>
     <w:p>
@@ -339,15 +323,7 @@
     </w:p>
     <w:p>
       <w:r>
-        <w:t xml:space="preserve">Name is now displaying in the </w:t>
-      </w:r>
-      <w:proofErr w:type="gramStart"/>
-      <w:r>
-        <w:t>console.log(</w:t>
-      </w:r>
-      <w:proofErr w:type="gramEnd"/>
-      <w:r>
-        <w:t>)</w:t>
+        <w:t>Name is now displaying in the console.log()</w:t>
       </w:r>
     </w:p>
     <w:p>
@@ -396,15 +372,7 @@
     <w:p/>
     <w:p>
       <w:r>
-        <w:t xml:space="preserve">Adding functionality for the Priority check to see what levels are being requested by the user via </w:t>
-      </w:r>
-      <w:proofErr w:type="gramStart"/>
-      <w:r>
-        <w:t>console.log(</w:t>
-      </w:r>
-      <w:proofErr w:type="gramEnd"/>
-      <w:r>
-        <w:t>)</w:t>
+        <w:t>Adding functionality for the Priority check to see what levels are being requested by the user via console.log()</w:t>
       </w:r>
     </w:p>
     <w:p>
@@ -538,6 +506,196 @@
             </a:graphic>
           </wp:inline>
         </w:drawing>
+      </w:r>
+    </w:p>
+    <w:p>
+      <w:r>
+        <w:t>Making changes to the JS file I now have a new error</w:t>
+      </w:r>
+    </w:p>
+    <w:p>
+      <w:r>
+        <w:rPr>
+          <w:noProof/>
+        </w:rPr>
+        <w:drawing>
+          <wp:inline distT="0" distB="0" distL="0" distR="0" wp14:anchorId="35B48F39" wp14:editId="459F8437">
+            <wp:extent cx="5731510" cy="739140"/>
+            <wp:effectExtent l="0" t="0" r="2540" b="3810"/>
+            <wp:docPr id="1321540637" name="Picture 1"/>
+            <wp:cNvGraphicFramePr>
+              <a:graphicFrameLocks xmlns:a="http://schemas.openxmlformats.org/drawingml/2006/main" noChangeAspect="1"/>
+            </wp:cNvGraphicFramePr>
+            <a:graphic xmlns:a="http://schemas.openxmlformats.org/drawingml/2006/main">
+              <a:graphicData uri="http://schemas.openxmlformats.org/drawingml/2006/picture">
+                <pic:pic xmlns:pic="http://schemas.openxmlformats.org/drawingml/2006/picture">
+                  <pic:nvPicPr>
+                    <pic:cNvPr id="1321540637" name=""/>
+                    <pic:cNvPicPr/>
+                  </pic:nvPicPr>
+                  <pic:blipFill>
+                    <a:blip r:embed="rId15"/>
+                    <a:stretch>
+                      <a:fillRect/>
+                    </a:stretch>
+                  </pic:blipFill>
+                  <pic:spPr>
+                    <a:xfrm>
+                      <a:off x="0" y="0"/>
+                      <a:ext cx="5731510" cy="739140"/>
+                    </a:xfrm>
+                    <a:prstGeom prst="rect">
+                      <a:avLst/>
+                    </a:prstGeom>
+                  </pic:spPr>
+                </pic:pic>
+              </a:graphicData>
+            </a:graphic>
+          </wp:inline>
+        </w:drawing>
+      </w:r>
+    </w:p>
+    <w:p/>
+    <w:p>
+      <w:r>
+        <w:rPr>
+          <w:noProof/>
+        </w:rPr>
+        <w:drawing>
+          <wp:inline distT="0" distB="0" distL="0" distR="0" wp14:anchorId="0B8DC4E8" wp14:editId="1DDC7A74">
+            <wp:extent cx="5731510" cy="1647190"/>
+            <wp:effectExtent l="0" t="0" r="2540" b="0"/>
+            <wp:docPr id="1077654915" name="Picture 1"/>
+            <wp:cNvGraphicFramePr>
+              <a:graphicFrameLocks xmlns:a="http://schemas.openxmlformats.org/drawingml/2006/main" noChangeAspect="1"/>
+            </wp:cNvGraphicFramePr>
+            <a:graphic xmlns:a="http://schemas.openxmlformats.org/drawingml/2006/main">
+              <a:graphicData uri="http://schemas.openxmlformats.org/drawingml/2006/picture">
+                <pic:pic xmlns:pic="http://schemas.openxmlformats.org/drawingml/2006/picture">
+                  <pic:nvPicPr>
+                    <pic:cNvPr id="1077654915" name=""/>
+                    <pic:cNvPicPr/>
+                  </pic:nvPicPr>
+                  <pic:blipFill>
+                    <a:blip r:embed="rId16"/>
+                    <a:stretch>
+                      <a:fillRect/>
+                    </a:stretch>
+                  </pic:blipFill>
+                  <pic:spPr>
+                    <a:xfrm>
+                      <a:off x="0" y="0"/>
+                      <a:ext cx="5731510" cy="1647190"/>
+                    </a:xfrm>
+                    <a:prstGeom prst="rect">
+                      <a:avLst/>
+                    </a:prstGeom>
+                  </pic:spPr>
+                </pic:pic>
+              </a:graphicData>
+            </a:graphic>
+          </wp:inline>
+        </w:drawing>
+      </w:r>
+    </w:p>
+    <w:p>
+      <w:r>
+        <w:t>And I believe this would cause the error.</w:t>
+      </w:r>
+    </w:p>
+    <w:p>
+      <w:r>
+        <w:t>Changed the else if to a string without trying pass in any parameters</w:t>
+      </w:r>
+    </w:p>
+    <w:p>
+      <w:r>
+        <w:rPr>
+          <w:noProof/>
+        </w:rPr>
+        <w:drawing>
+          <wp:inline distT="0" distB="0" distL="0" distR="0" wp14:anchorId="4C436C85" wp14:editId="7E82FC8E">
+            <wp:extent cx="5731510" cy="1788795"/>
+            <wp:effectExtent l="0" t="0" r="2540" b="1905"/>
+            <wp:docPr id="1346180450" name="Picture 1"/>
+            <wp:cNvGraphicFramePr>
+              <a:graphicFrameLocks xmlns:a="http://schemas.openxmlformats.org/drawingml/2006/main" noChangeAspect="1"/>
+            </wp:cNvGraphicFramePr>
+            <a:graphic xmlns:a="http://schemas.openxmlformats.org/drawingml/2006/main">
+              <a:graphicData uri="http://schemas.openxmlformats.org/drawingml/2006/picture">
+                <pic:pic xmlns:pic="http://schemas.openxmlformats.org/drawingml/2006/picture">
+                  <pic:nvPicPr>
+                    <pic:cNvPr id="1346180450" name=""/>
+                    <pic:cNvPicPr/>
+                  </pic:nvPicPr>
+                  <pic:blipFill>
+                    <a:blip r:embed="rId17"/>
+                    <a:stretch>
+                      <a:fillRect/>
+                    </a:stretch>
+                  </pic:blipFill>
+                  <pic:spPr>
+                    <a:xfrm>
+                      <a:off x="0" y="0"/>
+                      <a:ext cx="5731510" cy="1788795"/>
+                    </a:xfrm>
+                    <a:prstGeom prst="rect">
+                      <a:avLst/>
+                    </a:prstGeom>
+                  </pic:spPr>
+                </pic:pic>
+              </a:graphicData>
+            </a:graphic>
+          </wp:inline>
+        </w:drawing>
+      </w:r>
+    </w:p>
+    <w:p/>
+    <w:p>
+      <w:r>
+        <w:rPr>
+          <w:noProof/>
+        </w:rPr>
+        <w:lastRenderedPageBreak/>
+        <w:drawing>
+          <wp:inline distT="0" distB="0" distL="0" distR="0" wp14:anchorId="6F6EC0AB" wp14:editId="6DAC5040">
+            <wp:extent cx="5731510" cy="2983230"/>
+            <wp:effectExtent l="0" t="0" r="2540" b="7620"/>
+            <wp:docPr id="210977316" name="Picture 1"/>
+            <wp:cNvGraphicFramePr>
+              <a:graphicFrameLocks xmlns:a="http://schemas.openxmlformats.org/drawingml/2006/main" noChangeAspect="1"/>
+            </wp:cNvGraphicFramePr>
+            <a:graphic xmlns:a="http://schemas.openxmlformats.org/drawingml/2006/main">
+              <a:graphicData uri="http://schemas.openxmlformats.org/drawingml/2006/picture">
+                <pic:pic xmlns:pic="http://schemas.openxmlformats.org/drawingml/2006/picture">
+                  <pic:nvPicPr>
+                    <pic:cNvPr id="210977316" name=""/>
+                    <pic:cNvPicPr/>
+                  </pic:nvPicPr>
+                  <pic:blipFill>
+                    <a:blip r:embed="rId18"/>
+                    <a:stretch>
+                      <a:fillRect/>
+                    </a:stretch>
+                  </pic:blipFill>
+                  <pic:spPr>
+                    <a:xfrm>
+                      <a:off x="0" y="0"/>
+                      <a:ext cx="5731510" cy="2983230"/>
+                    </a:xfrm>
+                    <a:prstGeom prst="rect">
+                      <a:avLst/>
+                    </a:prstGeom>
+                  </pic:spPr>
+                </pic:pic>
+              </a:graphicData>
+            </a:graphic>
+          </wp:inline>
+        </w:drawing>
+      </w:r>
+      <w:r>
+        <w:br/>
+        <w:t>It appears that the if statement is missed and it goes straight to the final console.log</w:t>
       </w:r>
     </w:p>
     <w:sectPr>

</xml_diff>

<commit_message>
Tested changes and added screenshots of testing to JavaScriptValidation.docx
</commit_message>
<xml_diff>
--- a/PM-04/pm04-final-project/evidence/JavaScriptValidation.docx
+++ b/PM-04/pm04-final-project/evidence/JavaScriptValidation.docx
@@ -52,7 +52,15 @@
     <w:p/>
     <w:p>
       <w:r>
-        <w:t>Added function logic to stop a page refreshing after submit button is pressed, and added variables to my JS to allow to capture data into an array and set const variables</w:t>
+        <w:t xml:space="preserve">Added function logic to stop a page refreshing after submit button is pressed, and added variables to my JS to allow to capture data into an array and set </w:t>
+      </w:r>
+      <w:proofErr w:type="spellStart"/>
+      <w:r>
+        <w:t>const</w:t>
+      </w:r>
+      <w:proofErr w:type="spellEnd"/>
+      <w:r>
+        <w:t xml:space="preserve"> variables</w:t>
       </w:r>
     </w:p>
     <w:p>
@@ -228,7 +236,13 @@
         </w:numPr>
       </w:pPr>
       <w:r>
-        <w:t>After clicking the OK button, the Request output shows however I have a undefined error coming from my JS in my console log</w:t>
+        <w:t xml:space="preserve">After clicking the OK button, the Request output shows however I have </w:t>
+      </w:r>
+      <w:r>
+        <w:t>an</w:t>
+      </w:r>
+      <w:r>
+        <w:t xml:space="preserve"> undefined error coming from my JS in my console log</w:t>
       </w:r>
     </w:p>
     <w:p>
@@ -323,7 +337,13 @@
     </w:p>
     <w:p>
       <w:r>
-        <w:t>Name is now displaying in the console.log()</w:t>
+        <w:t xml:space="preserve">Name is now displaying in the </w:t>
+      </w:r>
+      <w:r>
+        <w:t>console.log (</w:t>
+      </w:r>
+      <w:r>
+        <w:t>)</w:t>
       </w:r>
     </w:p>
     <w:p>
@@ -372,7 +392,13 @@
     <w:p/>
     <w:p>
       <w:r>
-        <w:t>Adding functionality for the Priority check to see what levels are being requested by the user via console.log()</w:t>
+        <w:t xml:space="preserve">Adding functionality for the Priority check to see what levels are being requested by the user via </w:t>
+      </w:r>
+      <w:r>
+        <w:t>console.log (</w:t>
+      </w:r>
+      <w:r>
+        <w:t>)</w:t>
       </w:r>
     </w:p>
     <w:p>
@@ -696,6 +722,297 @@
       <w:r>
         <w:br/>
         <w:t>It appears that the if statement is missed and it goes straight to the final console.log</w:t>
+      </w:r>
+    </w:p>
+    <w:p>
+      <w:r>
+        <w:t>Updated JS to cater for all priority levels in an IF statement:</w:t>
+      </w:r>
+    </w:p>
+    <w:p>
+      <w:r>
+        <w:rPr>
+          <w:noProof/>
+        </w:rPr>
+        <w:drawing>
+          <wp:inline distT="0" distB="0" distL="0" distR="0" wp14:anchorId="35716ECB" wp14:editId="126DA900">
+            <wp:extent cx="5731510" cy="2016760"/>
+            <wp:effectExtent l="0" t="0" r="2540" b="2540"/>
+            <wp:docPr id="1874927132" name="Picture 1"/>
+            <wp:cNvGraphicFramePr>
+              <a:graphicFrameLocks xmlns:a="http://schemas.openxmlformats.org/drawingml/2006/main" noChangeAspect="1"/>
+            </wp:cNvGraphicFramePr>
+            <a:graphic xmlns:a="http://schemas.openxmlformats.org/drawingml/2006/main">
+              <a:graphicData uri="http://schemas.openxmlformats.org/drawingml/2006/picture">
+                <pic:pic xmlns:pic="http://schemas.openxmlformats.org/drawingml/2006/picture">
+                  <pic:nvPicPr>
+                    <pic:cNvPr id="1874927132" name=""/>
+                    <pic:cNvPicPr/>
+                  </pic:nvPicPr>
+                  <pic:blipFill>
+                    <a:blip r:embed="rId19"/>
+                    <a:stretch>
+                      <a:fillRect/>
+                    </a:stretch>
+                  </pic:blipFill>
+                  <pic:spPr>
+                    <a:xfrm>
+                      <a:off x="0" y="0"/>
+                      <a:ext cx="5731510" cy="2016760"/>
+                    </a:xfrm>
+                    <a:prstGeom prst="rect">
+                      <a:avLst/>
+                    </a:prstGeom>
+                  </pic:spPr>
+                </pic:pic>
+              </a:graphicData>
+            </a:graphic>
+          </wp:inline>
+        </w:drawing>
+      </w:r>
+    </w:p>
+    <w:p>
+      <w:r>
+        <w:t>Also added a form reset function to clear data in form after submit is clicked</w:t>
+      </w:r>
+    </w:p>
+    <w:p>
+      <w:r>
+        <w:rPr>
+          <w:noProof/>
+        </w:rPr>
+        <w:drawing>
+          <wp:inline distT="0" distB="0" distL="0" distR="0" wp14:anchorId="591F22B1" wp14:editId="70097502">
+            <wp:extent cx="5731510" cy="1506220"/>
+            <wp:effectExtent l="0" t="0" r="2540" b="0"/>
+            <wp:docPr id="1954043492" name="Picture 1"/>
+            <wp:cNvGraphicFramePr>
+              <a:graphicFrameLocks xmlns:a="http://schemas.openxmlformats.org/drawingml/2006/main" noChangeAspect="1"/>
+            </wp:cNvGraphicFramePr>
+            <a:graphic xmlns:a="http://schemas.openxmlformats.org/drawingml/2006/main">
+              <a:graphicData uri="http://schemas.openxmlformats.org/drawingml/2006/picture">
+                <pic:pic xmlns:pic="http://schemas.openxmlformats.org/drawingml/2006/picture">
+                  <pic:nvPicPr>
+                    <pic:cNvPr id="1954043492" name=""/>
+                    <pic:cNvPicPr/>
+                  </pic:nvPicPr>
+                  <pic:blipFill>
+                    <a:blip r:embed="rId20"/>
+                    <a:stretch>
+                      <a:fillRect/>
+                    </a:stretch>
+                  </pic:blipFill>
+                  <pic:spPr>
+                    <a:xfrm>
+                      <a:off x="0" y="0"/>
+                      <a:ext cx="5731510" cy="1506220"/>
+                    </a:xfrm>
+                    <a:prstGeom prst="rect">
+                      <a:avLst/>
+                    </a:prstGeom>
+                  </pic:spPr>
+                </pic:pic>
+              </a:graphicData>
+            </a:graphic>
+          </wp:inline>
+        </w:drawing>
+      </w:r>
+    </w:p>
+    <w:p/>
+    <w:p>
+      <w:r>
+        <w:t>Test:</w:t>
+      </w:r>
+    </w:p>
+    <w:p>
+      <w:r>
+        <w:t xml:space="preserve">HTML loads and user </w:t>
+      </w:r>
+      <w:r>
+        <w:t>put</w:t>
+      </w:r>
+      <w:r>
+        <w:t xml:space="preserve"> in the needed details:</w:t>
+      </w:r>
+    </w:p>
+    <w:p>
+      <w:r>
+        <w:rPr>
+          <w:noProof/>
+        </w:rPr>
+        <w:lastRenderedPageBreak/>
+        <w:drawing>
+          <wp:inline distT="0" distB="0" distL="0" distR="0" wp14:anchorId="3F05F997" wp14:editId="186B37B6">
+            <wp:extent cx="5731510" cy="3005455"/>
+            <wp:effectExtent l="0" t="0" r="2540" b="4445"/>
+            <wp:docPr id="644623888" name="Picture 1"/>
+            <wp:cNvGraphicFramePr>
+              <a:graphicFrameLocks xmlns:a="http://schemas.openxmlformats.org/drawingml/2006/main" noChangeAspect="1"/>
+            </wp:cNvGraphicFramePr>
+            <a:graphic xmlns:a="http://schemas.openxmlformats.org/drawingml/2006/main">
+              <a:graphicData uri="http://schemas.openxmlformats.org/drawingml/2006/picture">
+                <pic:pic xmlns:pic="http://schemas.openxmlformats.org/drawingml/2006/picture">
+                  <pic:nvPicPr>
+                    <pic:cNvPr id="644623888" name=""/>
+                    <pic:cNvPicPr/>
+                  </pic:nvPicPr>
+                  <pic:blipFill>
+                    <a:blip r:embed="rId21"/>
+                    <a:stretch>
+                      <a:fillRect/>
+                    </a:stretch>
+                  </pic:blipFill>
+                  <pic:spPr>
+                    <a:xfrm>
+                      <a:off x="0" y="0"/>
+                      <a:ext cx="5731510" cy="3005455"/>
+                    </a:xfrm>
+                    <a:prstGeom prst="rect">
+                      <a:avLst/>
+                    </a:prstGeom>
+                  </pic:spPr>
+                </pic:pic>
+              </a:graphicData>
+            </a:graphic>
+          </wp:inline>
+        </w:drawing>
+      </w:r>
+    </w:p>
+    <w:p>
+      <w:r>
+        <w:t xml:space="preserve">User clicks submit and a </w:t>
+      </w:r>
+      <w:r>
+        <w:t>pop-up</w:t>
+      </w:r>
+      <w:r>
+        <w:t xml:space="preserve"> displays </w:t>
+      </w:r>
+      <w:r>
+        <w:t>as well</w:t>
+      </w:r>
+      <w:r>
+        <w:t xml:space="preserve"> as the console log updates: </w:t>
+      </w:r>
+      <w:r>
+        <w:rPr>
+          <w:noProof/>
+        </w:rPr>
+        <w:drawing>
+          <wp:inline distT="0" distB="0" distL="0" distR="0" wp14:anchorId="6C7BEA67" wp14:editId="31CD0D5E">
+            <wp:extent cx="5731510" cy="3188335"/>
+            <wp:effectExtent l="0" t="0" r="2540" b="0"/>
+            <wp:docPr id="942595248" name="Picture 1"/>
+            <wp:cNvGraphicFramePr>
+              <a:graphicFrameLocks xmlns:a="http://schemas.openxmlformats.org/drawingml/2006/main" noChangeAspect="1"/>
+            </wp:cNvGraphicFramePr>
+            <a:graphic xmlns:a="http://schemas.openxmlformats.org/drawingml/2006/main">
+              <a:graphicData uri="http://schemas.openxmlformats.org/drawingml/2006/picture">
+                <pic:pic xmlns:pic="http://schemas.openxmlformats.org/drawingml/2006/picture">
+                  <pic:nvPicPr>
+                    <pic:cNvPr id="942595248" name=""/>
+                    <pic:cNvPicPr/>
+                  </pic:nvPicPr>
+                  <pic:blipFill>
+                    <a:blip r:embed="rId22"/>
+                    <a:stretch>
+                      <a:fillRect/>
+                    </a:stretch>
+                  </pic:blipFill>
+                  <pic:spPr>
+                    <a:xfrm>
+                      <a:off x="0" y="0"/>
+                      <a:ext cx="5731510" cy="3188335"/>
+                    </a:xfrm>
+                    <a:prstGeom prst="rect">
+                      <a:avLst/>
+                    </a:prstGeom>
+                  </pic:spPr>
+                </pic:pic>
+              </a:graphicData>
+            </a:graphic>
+          </wp:inline>
+        </w:drawing>
+      </w:r>
+    </w:p>
+    <w:p>
+      <w:r>
+        <w:t xml:space="preserve">After clicking OK, </w:t>
+      </w:r>
+      <w:r>
+        <w:t>your</w:t>
+      </w:r>
+      <w:r>
+        <w:t xml:space="preserve"> request Priority is displayed, </w:t>
+      </w:r>
+      <w:r>
+        <w:t>your</w:t>
+      </w:r>
+      <w:r>
+        <w:t xml:space="preserve"> request summary gets displayed and any historical requests are displayed. Additionally, the console log displays </w:t>
+      </w:r>
+      <w:r>
+        <w:t xml:space="preserve">the requester name, indicates that the listing function is called </w:t>
+      </w:r>
+      <w:r>
+        <w:t>and</w:t>
+      </w:r>
+      <w:r>
+        <w:t xml:space="preserve"> displays the priority level</w:t>
+      </w:r>
+      <w:r>
+        <w:t xml:space="preserve"> and the form inputted data gets </w:t>
+      </w:r>
+      <w:proofErr w:type="spellStart"/>
+      <w:r>
+        <w:t>reset</w:t>
+      </w:r>
+      <w:r>
+        <w:t>b</w:t>
+      </w:r>
+      <w:proofErr w:type="spellEnd"/>
+    </w:p>
+    <w:p>
+      <w:r>
+        <w:rPr>
+          <w:noProof/>
+        </w:rPr>
+        <w:lastRenderedPageBreak/>
+        <w:drawing>
+          <wp:inline distT="0" distB="0" distL="0" distR="0" wp14:anchorId="5684901B" wp14:editId="44A06B27">
+            <wp:extent cx="5731510" cy="3860800"/>
+            <wp:effectExtent l="0" t="0" r="2540" b="6350"/>
+            <wp:docPr id="1970689216" name="Picture 1"/>
+            <wp:cNvGraphicFramePr>
+              <a:graphicFrameLocks xmlns:a="http://schemas.openxmlformats.org/drawingml/2006/main" noChangeAspect="1"/>
+            </wp:cNvGraphicFramePr>
+            <a:graphic xmlns:a="http://schemas.openxmlformats.org/drawingml/2006/main">
+              <a:graphicData uri="http://schemas.openxmlformats.org/drawingml/2006/picture">
+                <pic:pic xmlns:pic="http://schemas.openxmlformats.org/drawingml/2006/picture">
+                  <pic:nvPicPr>
+                    <pic:cNvPr id="1970689216" name=""/>
+                    <pic:cNvPicPr/>
+                  </pic:nvPicPr>
+                  <pic:blipFill>
+                    <a:blip r:embed="rId23"/>
+                    <a:stretch>
+                      <a:fillRect/>
+                    </a:stretch>
+                  </pic:blipFill>
+                  <pic:spPr>
+                    <a:xfrm>
+                      <a:off x="0" y="0"/>
+                      <a:ext cx="5731510" cy="3860800"/>
+                    </a:xfrm>
+                    <a:prstGeom prst="rect">
+                      <a:avLst/>
+                    </a:prstGeom>
+                  </pic:spPr>
+                </pic:pic>
+              </a:graphicData>
+            </a:graphic>
+          </wp:inline>
+        </w:drawing>
       </w:r>
     </w:p>
     <w:sectPr>

</xml_diff>

<commit_message>
Fixed historical form and also added test evidence of issue found
</commit_message>
<xml_diff>
--- a/PM-04/pm04-final-project/evidence/JavaScriptValidation.docx
+++ b/PM-04/pm04-final-project/evidence/JavaScriptValidation.docx
@@ -52,15 +52,7 @@
     <w:p/>
     <w:p>
       <w:r>
-        <w:t xml:space="preserve">Added function logic to stop a page refreshing after submit button is pressed, and added variables to my JS to allow to capture data into an array and set </w:t>
-      </w:r>
-      <w:proofErr w:type="spellStart"/>
-      <w:r>
-        <w:t>const</w:t>
-      </w:r>
-      <w:proofErr w:type="spellEnd"/>
-      <w:r>
-        <w:t xml:space="preserve"> variables</w:t>
+        <w:t>Added function logic to stop a page refreshing after submit button is pressed, and added variables to my JS to allow to capture data into an array and set const variables</w:t>
       </w:r>
     </w:p>
     <w:p>
@@ -961,16 +953,11 @@
         <w:t xml:space="preserve"> displays the priority level</w:t>
       </w:r>
       <w:r>
-        <w:t xml:space="preserve"> and the form inputted data gets </w:t>
-      </w:r>
-      <w:proofErr w:type="spellStart"/>
-      <w:r>
-        <w:t>reset</w:t>
+        <w:t xml:space="preserve"> and the form inputted data gets reset</w:t>
       </w:r>
       <w:r>
         <w:t>b</w:t>
       </w:r>
-      <w:proofErr w:type="spellEnd"/>
     </w:p>
     <w:p>
       <w:r>
@@ -1013,6 +1000,110 @@
             </a:graphic>
           </wp:inline>
         </w:drawing>
+      </w:r>
+    </w:p>
+    <w:p>
+      <w:r>
+        <w:t>Found some errors with the submit button:</w:t>
+      </w:r>
+    </w:p>
+    <w:p>
+      <w:r>
+        <w:t>If the user does not put in any of the required fields the alert still pops up</w:t>
+      </w:r>
+    </w:p>
+    <w:p>
+      <w:r>
+        <w:rPr>
+          <w:noProof/>
+        </w:rPr>
+        <w:drawing>
+          <wp:inline distT="0" distB="0" distL="0" distR="0" wp14:anchorId="0A9A2736" wp14:editId="03CEEA09">
+            <wp:extent cx="5731510" cy="3006090"/>
+            <wp:effectExtent l="0" t="0" r="2540" b="3810"/>
+            <wp:docPr id="1259420655" name="Picture 1"/>
+            <wp:cNvGraphicFramePr>
+              <a:graphicFrameLocks xmlns:a="http://schemas.openxmlformats.org/drawingml/2006/main" noChangeAspect="1"/>
+            </wp:cNvGraphicFramePr>
+            <a:graphic xmlns:a="http://schemas.openxmlformats.org/drawingml/2006/main">
+              <a:graphicData uri="http://schemas.openxmlformats.org/drawingml/2006/picture">
+                <pic:pic xmlns:pic="http://schemas.openxmlformats.org/drawingml/2006/picture">
+                  <pic:nvPicPr>
+                    <pic:cNvPr id="1259420655" name=""/>
+                    <pic:cNvPicPr/>
+                  </pic:nvPicPr>
+                  <pic:blipFill>
+                    <a:blip r:embed="rId24"/>
+                    <a:stretch>
+                      <a:fillRect/>
+                    </a:stretch>
+                  </pic:blipFill>
+                  <pic:spPr>
+                    <a:xfrm>
+                      <a:off x="0" y="0"/>
+                      <a:ext cx="5731510" cy="3006090"/>
+                    </a:xfrm>
+                    <a:prstGeom prst="rect">
+                      <a:avLst/>
+                    </a:prstGeom>
+                  </pic:spPr>
+                </pic:pic>
+              </a:graphicData>
+            </a:graphic>
+          </wp:inline>
+        </w:drawing>
+      </w:r>
+    </w:p>
+    <w:p>
+      <w:r>
+        <w:rPr>
+          <w:noProof/>
+        </w:rPr>
+        <w:lastRenderedPageBreak/>
+        <w:drawing>
+          <wp:inline distT="0" distB="0" distL="0" distR="0" wp14:anchorId="66F1016D" wp14:editId="286BF115">
+            <wp:extent cx="5731510" cy="6854825"/>
+            <wp:effectExtent l="0" t="0" r="2540" b="3175"/>
+            <wp:docPr id="2113794666" name="Picture 1"/>
+            <wp:cNvGraphicFramePr>
+              <a:graphicFrameLocks xmlns:a="http://schemas.openxmlformats.org/drawingml/2006/main" noChangeAspect="1"/>
+            </wp:cNvGraphicFramePr>
+            <a:graphic xmlns:a="http://schemas.openxmlformats.org/drawingml/2006/main">
+              <a:graphicData uri="http://schemas.openxmlformats.org/drawingml/2006/picture">
+                <pic:pic xmlns:pic="http://schemas.openxmlformats.org/drawingml/2006/picture">
+                  <pic:nvPicPr>
+                    <pic:cNvPr id="2113794666" name=""/>
+                    <pic:cNvPicPr/>
+                  </pic:nvPicPr>
+                  <pic:blipFill>
+                    <a:blip r:embed="rId25"/>
+                    <a:stretch>
+                      <a:fillRect/>
+                    </a:stretch>
+                  </pic:blipFill>
+                  <pic:spPr>
+                    <a:xfrm>
+                      <a:off x="0" y="0"/>
+                      <a:ext cx="5731510" cy="6854825"/>
+                    </a:xfrm>
+                    <a:prstGeom prst="rect">
+                      <a:avLst/>
+                    </a:prstGeom>
+                  </pic:spPr>
+                </pic:pic>
+              </a:graphicData>
+            </a:graphic>
+          </wp:inline>
+        </w:drawing>
+      </w:r>
+    </w:p>
+    <w:p/>
+    <w:p>
+      <w:r>
+        <w:t xml:space="preserve">Will need to do a check on each required field if it is not filled in , then rather have the submit button disabled </w:t>
+      </w:r>
+      <w:r>
+        <w:t>or highlight which fields needs to be filled in</w:t>
       </w:r>
     </w:p>
     <w:sectPr>

</xml_diff>

<commit_message>
Worked on error handling by disabling the submit button until all fields are filled in
</commit_message>
<xml_diff>
--- a/PM-04/pm04-final-project/evidence/JavaScriptValidation.docx
+++ b/PM-04/pm04-final-project/evidence/JavaScriptValidation.docx
@@ -1100,10 +1100,153 @@
     <w:p/>
     <w:p>
       <w:r>
-        <w:t xml:space="preserve">Will need to do a check on each required field if it is not filled in , then rather have the submit button disabled </w:t>
+        <w:t xml:space="preserve">Will need to do a check on each required field if it is not filled in, then rather have the submit button disabled </w:t>
       </w:r>
       <w:r>
         <w:t>or highlight which fields needs to be filled in</w:t>
+      </w:r>
+    </w:p>
+    <w:p>
+      <w:r>
+        <w:t>---------------------------------------------------------------------------------------------------------</w:t>
+      </w:r>
+    </w:p>
+    <w:p>
+      <w:r>
+        <w:t>Updated my html , css and js file to disable the submit button and also check for validation that all fields are filled in before enabling the button:</w:t>
+      </w:r>
+    </w:p>
+    <w:p>
+      <w:r>
+        <w:rPr>
+          <w:noProof/>
+        </w:rPr>
+        <w:lastRenderedPageBreak/>
+        <w:drawing>
+          <wp:inline distT="0" distB="0" distL="0" distR="0" wp14:anchorId="4A021464" wp14:editId="6713CA9B">
+            <wp:extent cx="5731510" cy="3129280"/>
+            <wp:effectExtent l="0" t="0" r="2540" b="0"/>
+            <wp:docPr id="564274850" name="Picture 1"/>
+            <wp:cNvGraphicFramePr>
+              <a:graphicFrameLocks xmlns:a="http://schemas.openxmlformats.org/drawingml/2006/main" noChangeAspect="1"/>
+            </wp:cNvGraphicFramePr>
+            <a:graphic xmlns:a="http://schemas.openxmlformats.org/drawingml/2006/main">
+              <a:graphicData uri="http://schemas.openxmlformats.org/drawingml/2006/picture">
+                <pic:pic xmlns:pic="http://schemas.openxmlformats.org/drawingml/2006/picture">
+                  <pic:nvPicPr>
+                    <pic:cNvPr id="564274850" name=""/>
+                    <pic:cNvPicPr/>
+                  </pic:nvPicPr>
+                  <pic:blipFill>
+                    <a:blip r:embed="rId26"/>
+                    <a:stretch>
+                      <a:fillRect/>
+                    </a:stretch>
+                  </pic:blipFill>
+                  <pic:spPr>
+                    <a:xfrm>
+                      <a:off x="0" y="0"/>
+                      <a:ext cx="5731510" cy="3129280"/>
+                    </a:xfrm>
+                    <a:prstGeom prst="rect">
+                      <a:avLst/>
+                    </a:prstGeom>
+                  </pic:spPr>
+                </pic:pic>
+              </a:graphicData>
+            </a:graphic>
+          </wp:inline>
+        </w:drawing>
+      </w:r>
+    </w:p>
+    <w:p>
+      <w:r>
+        <w:rPr>
+          <w:noProof/>
+        </w:rPr>
+        <w:drawing>
+          <wp:inline distT="0" distB="0" distL="0" distR="0" wp14:anchorId="4FB9F4C0" wp14:editId="36ECE377">
+            <wp:extent cx="5731510" cy="3047365"/>
+            <wp:effectExtent l="0" t="0" r="2540" b="635"/>
+            <wp:docPr id="1234465353" name="Picture 1"/>
+            <wp:cNvGraphicFramePr>
+              <a:graphicFrameLocks xmlns:a="http://schemas.openxmlformats.org/drawingml/2006/main" noChangeAspect="1"/>
+            </wp:cNvGraphicFramePr>
+            <a:graphic xmlns:a="http://schemas.openxmlformats.org/drawingml/2006/main">
+              <a:graphicData uri="http://schemas.openxmlformats.org/drawingml/2006/picture">
+                <pic:pic xmlns:pic="http://schemas.openxmlformats.org/drawingml/2006/picture">
+                  <pic:nvPicPr>
+                    <pic:cNvPr id="1234465353" name=""/>
+                    <pic:cNvPicPr/>
+                  </pic:nvPicPr>
+                  <pic:blipFill>
+                    <a:blip r:embed="rId27"/>
+                    <a:stretch>
+                      <a:fillRect/>
+                    </a:stretch>
+                  </pic:blipFill>
+                  <pic:spPr>
+                    <a:xfrm>
+                      <a:off x="0" y="0"/>
+                      <a:ext cx="5731510" cy="3047365"/>
+                    </a:xfrm>
+                    <a:prstGeom prst="rect">
+                      <a:avLst/>
+                    </a:prstGeom>
+                  </pic:spPr>
+                </pic:pic>
+              </a:graphicData>
+            </a:graphic>
+          </wp:inline>
+        </w:drawing>
+      </w:r>
+    </w:p>
+    <w:p>
+      <w:r>
+        <w:t>Once user submits the form resets and the button is disabled once more</w:t>
+      </w:r>
+    </w:p>
+    <w:p>
+      <w:r>
+        <w:rPr>
+          <w:noProof/>
+        </w:rPr>
+        <w:lastRenderedPageBreak/>
+        <w:drawing>
+          <wp:inline distT="0" distB="0" distL="0" distR="0" wp14:anchorId="245CE1E4" wp14:editId="4062DEB8">
+            <wp:extent cx="5731510" cy="3609975"/>
+            <wp:effectExtent l="0" t="0" r="2540" b="9525"/>
+            <wp:docPr id="993424415" name="Picture 1"/>
+            <wp:cNvGraphicFramePr>
+              <a:graphicFrameLocks xmlns:a="http://schemas.openxmlformats.org/drawingml/2006/main" noChangeAspect="1"/>
+            </wp:cNvGraphicFramePr>
+            <a:graphic xmlns:a="http://schemas.openxmlformats.org/drawingml/2006/main">
+              <a:graphicData uri="http://schemas.openxmlformats.org/drawingml/2006/picture">
+                <pic:pic xmlns:pic="http://schemas.openxmlformats.org/drawingml/2006/picture">
+                  <pic:nvPicPr>
+                    <pic:cNvPr id="993424415" name=""/>
+                    <pic:cNvPicPr/>
+                  </pic:nvPicPr>
+                  <pic:blipFill>
+                    <a:blip r:embed="rId28"/>
+                    <a:stretch>
+                      <a:fillRect/>
+                    </a:stretch>
+                  </pic:blipFill>
+                  <pic:spPr>
+                    <a:xfrm>
+                      <a:off x="0" y="0"/>
+                      <a:ext cx="5731510" cy="3609975"/>
+                    </a:xfrm>
+                    <a:prstGeom prst="rect">
+                      <a:avLst/>
+                    </a:prstGeom>
+                  </pic:spPr>
+                </pic:pic>
+              </a:graphicData>
+            </a:graphic>
+          </wp:inline>
+        </w:drawing>
       </w:r>
     </w:p>
     <w:sectPr>

</xml_diff>

<commit_message>
Added test evidence to the docx for js validation and also added comments to the js file
</commit_message>
<xml_diff>
--- a/PM-04/pm04-final-project/evidence/JavaScriptValidation.docx
+++ b/PM-04/pm04-final-project/evidence/JavaScriptValidation.docx
@@ -52,7 +52,15 @@
     <w:p/>
     <w:p>
       <w:r>
-        <w:t>Added function logic to stop a page refreshing after submit button is pressed, and added variables to my JS to allow to capture data into an array and set const variables</w:t>
+        <w:t xml:space="preserve">Added function logic to stop a page refreshing after submit button is pressed, and added variables to my JS to allow to capture data into an array and set </w:t>
+      </w:r>
+      <w:proofErr w:type="spellStart"/>
+      <w:r>
+        <w:t>const</w:t>
+      </w:r>
+      <w:proofErr w:type="spellEnd"/>
+      <w:r>
+        <w:t xml:space="preserve"> variables</w:t>
       </w:r>
     </w:p>
     <w:p>
@@ -765,7 +773,15 @@
     </w:p>
     <w:p>
       <w:r>
-        <w:t>Also added a form reset function to clear data in form after submit is clicked</w:t>
+        <w:t xml:space="preserve">Also added a form reset function to clear data in form after </w:t>
+      </w:r>
+      <w:proofErr w:type="gramStart"/>
+      <w:r>
+        <w:t>submit</w:t>
+      </w:r>
+      <w:proofErr w:type="gramEnd"/>
+      <w:r>
+        <w:t xml:space="preserve"> is clicked</w:t>
       </w:r>
     </w:p>
     <w:p>
@@ -875,10 +891,10 @@
         <w:t xml:space="preserve">User clicks submit and a </w:t>
       </w:r>
       <w:r>
-        <w:t>pop-up</w:t>
-      </w:r>
-      <w:r>
-        <w:t xml:space="preserve"> displays </w:t>
+        <w:t>pop-up display</w:t>
+      </w:r>
+      <w:r>
+        <w:t xml:space="preserve"> </w:t>
       </w:r>
       <w:r>
         <w:t>as well</w:t>
@@ -954,9 +970,6 @@
       </w:r>
       <w:r>
         <w:t xml:space="preserve"> and the form inputted data gets reset</w:t>
-      </w:r>
-      <w:r>
-        <w:t>b</w:t>
       </w:r>
     </w:p>
     <w:p>
@@ -1113,7 +1126,39 @@
     </w:p>
     <w:p>
       <w:r>
-        <w:t>Updated my html , css and js file to disable the submit button and also check for validation that all fields are filled in before enabling the button:</w:t>
+        <w:t xml:space="preserve">Updated my </w:t>
+      </w:r>
+      <w:proofErr w:type="gramStart"/>
+      <w:r>
+        <w:t>html ,</w:t>
+      </w:r>
+      <w:proofErr w:type="gramEnd"/>
+      <w:r>
+        <w:t xml:space="preserve"> </w:t>
+      </w:r>
+      <w:proofErr w:type="spellStart"/>
+      <w:r>
+        <w:t>css</w:t>
+      </w:r>
+      <w:proofErr w:type="spellEnd"/>
+      <w:r>
+        <w:t xml:space="preserve"> and </w:t>
+      </w:r>
+      <w:proofErr w:type="spellStart"/>
+      <w:r>
+        <w:t>js</w:t>
+      </w:r>
+      <w:proofErr w:type="spellEnd"/>
+      <w:r>
+        <w:t xml:space="preserve"> file to disable the submit button </w:t>
+      </w:r>
+      <w:proofErr w:type="gramStart"/>
+      <w:r>
+        <w:t>and also</w:t>
+      </w:r>
+      <w:proofErr w:type="gramEnd"/>
+      <w:r>
+        <w:t xml:space="preserve"> check for validation that all fields are filled in before enabling the button:</w:t>
       </w:r>
     </w:p>
     <w:p>
@@ -1237,6 +1282,228 @@
                     <a:xfrm>
                       <a:off x="0" y="0"/>
                       <a:ext cx="5731510" cy="3609975"/>
+                    </a:xfrm>
+                    <a:prstGeom prst="rect">
+                      <a:avLst/>
+                    </a:prstGeom>
+                  </pic:spPr>
+                </pic:pic>
+              </a:graphicData>
+            </a:graphic>
+          </wp:inline>
+        </w:drawing>
+      </w:r>
+    </w:p>
+    <w:p>
+      <w:r>
+        <w:t xml:space="preserve">Added priority level </w:t>
+      </w:r>
+      <w:proofErr w:type="spellStart"/>
+      <w:r>
+        <w:t>colors</w:t>
+      </w:r>
+      <w:proofErr w:type="spellEnd"/>
+      <w:r>
+        <w:t xml:space="preserve"> to the </w:t>
+      </w:r>
+      <w:proofErr w:type="spellStart"/>
+      <w:r>
+        <w:t>css</w:t>
+      </w:r>
+      <w:proofErr w:type="spellEnd"/>
+      <w:r>
+        <w:t xml:space="preserve"> file, I did this by adding a class for the priority level and calling that class in my </w:t>
+      </w:r>
+      <w:proofErr w:type="spellStart"/>
+      <w:r>
+        <w:t>css</w:t>
+      </w:r>
+      <w:proofErr w:type="spellEnd"/>
+      <w:r>
+        <w:t xml:space="preserve"> file</w:t>
+      </w:r>
+    </w:p>
+    <w:p>
+      <w:r>
+        <w:rPr>
+          <w:noProof/>
+        </w:rPr>
+        <w:drawing>
+          <wp:inline distT="0" distB="0" distL="0" distR="0" wp14:anchorId="26873216" wp14:editId="2B994C16">
+            <wp:extent cx="5114925" cy="638175"/>
+            <wp:effectExtent l="0" t="0" r="9525" b="9525"/>
+            <wp:docPr id="1704991665" name="Picture 1"/>
+            <wp:cNvGraphicFramePr>
+              <a:graphicFrameLocks xmlns:a="http://schemas.openxmlformats.org/drawingml/2006/main" noChangeAspect="1"/>
+            </wp:cNvGraphicFramePr>
+            <a:graphic xmlns:a="http://schemas.openxmlformats.org/drawingml/2006/main">
+              <a:graphicData uri="http://schemas.openxmlformats.org/drawingml/2006/picture">
+                <pic:pic xmlns:pic="http://schemas.openxmlformats.org/drawingml/2006/picture">
+                  <pic:nvPicPr>
+                    <pic:cNvPr id="1704991665" name=""/>
+                    <pic:cNvPicPr/>
+                  </pic:nvPicPr>
+                  <pic:blipFill>
+                    <a:blip r:embed="rId29"/>
+                    <a:stretch>
+                      <a:fillRect/>
+                    </a:stretch>
+                  </pic:blipFill>
+                  <pic:spPr>
+                    <a:xfrm>
+                      <a:off x="0" y="0"/>
+                      <a:ext cx="5114925" cy="638175"/>
+                    </a:xfrm>
+                    <a:prstGeom prst="rect">
+                      <a:avLst/>
+                    </a:prstGeom>
+                  </pic:spPr>
+                </pic:pic>
+              </a:graphicData>
+            </a:graphic>
+          </wp:inline>
+        </w:drawing>
+      </w:r>
+    </w:p>
+    <w:p>
+      <w:r>
+        <w:t>Also am logging this out to the console to see for debugging purposes</w:t>
+      </w:r>
+    </w:p>
+    <w:p>
+      <w:r>
+        <w:rPr>
+          <w:noProof/>
+        </w:rPr>
+        <w:drawing>
+          <wp:inline distT="0" distB="0" distL="0" distR="0" wp14:anchorId="4CDB2649" wp14:editId="1BE6ED98">
+            <wp:extent cx="5731510" cy="2631440"/>
+            <wp:effectExtent l="0" t="0" r="2540" b="0"/>
+            <wp:docPr id="1078453384" name="Picture 1"/>
+            <wp:cNvGraphicFramePr>
+              <a:graphicFrameLocks xmlns:a="http://schemas.openxmlformats.org/drawingml/2006/main" noChangeAspect="1"/>
+            </wp:cNvGraphicFramePr>
+            <a:graphic xmlns:a="http://schemas.openxmlformats.org/drawingml/2006/main">
+              <a:graphicData uri="http://schemas.openxmlformats.org/drawingml/2006/picture">
+                <pic:pic xmlns:pic="http://schemas.openxmlformats.org/drawingml/2006/picture">
+                  <pic:nvPicPr>
+                    <pic:cNvPr id="1078453384" name=""/>
+                    <pic:cNvPicPr/>
+                  </pic:nvPicPr>
+                  <pic:blipFill>
+                    <a:blip r:embed="rId30"/>
+                    <a:stretch>
+                      <a:fillRect/>
+                    </a:stretch>
+                  </pic:blipFill>
+                  <pic:spPr>
+                    <a:xfrm>
+                      <a:off x="0" y="0"/>
+                      <a:ext cx="5731510" cy="2631440"/>
+                    </a:xfrm>
+                    <a:prstGeom prst="rect">
+                      <a:avLst/>
+                    </a:prstGeom>
+                  </pic:spPr>
+                </pic:pic>
+              </a:graphicData>
+            </a:graphic>
+          </wp:inline>
+        </w:drawing>
+      </w:r>
+    </w:p>
+    <w:p>
+      <w:r>
+        <w:t xml:space="preserve">CSS has been added for the </w:t>
+      </w:r>
+      <w:proofErr w:type="spellStart"/>
+      <w:r>
+        <w:t>colors</w:t>
+      </w:r>
+      <w:proofErr w:type="spellEnd"/>
+      <w:r>
+        <w:t xml:space="preserve"> to display</w:t>
+      </w:r>
+    </w:p>
+    <w:p>
+      <w:r>
+        <w:rPr>
+          <w:noProof/>
+        </w:rPr>
+        <w:lastRenderedPageBreak/>
+        <w:drawing>
+          <wp:inline distT="0" distB="0" distL="0" distR="0" wp14:anchorId="26418C91" wp14:editId="0D74B67A">
+            <wp:extent cx="5731510" cy="7689215"/>
+            <wp:effectExtent l="0" t="0" r="2540" b="6985"/>
+            <wp:docPr id="595915541" name="Picture 1"/>
+            <wp:cNvGraphicFramePr>
+              <a:graphicFrameLocks xmlns:a="http://schemas.openxmlformats.org/drawingml/2006/main" noChangeAspect="1"/>
+            </wp:cNvGraphicFramePr>
+            <a:graphic xmlns:a="http://schemas.openxmlformats.org/drawingml/2006/main">
+              <a:graphicData uri="http://schemas.openxmlformats.org/drawingml/2006/picture">
+                <pic:pic xmlns:pic="http://schemas.openxmlformats.org/drawingml/2006/picture">
+                  <pic:nvPicPr>
+                    <pic:cNvPr id="595915541" name=""/>
+                    <pic:cNvPicPr/>
+                  </pic:nvPicPr>
+                  <pic:blipFill>
+                    <a:blip r:embed="rId31"/>
+                    <a:stretch>
+                      <a:fillRect/>
+                    </a:stretch>
+                  </pic:blipFill>
+                  <pic:spPr>
+                    <a:xfrm>
+                      <a:off x="0" y="0"/>
+                      <a:ext cx="5731510" cy="7689215"/>
+                    </a:xfrm>
+                    <a:prstGeom prst="rect">
+                      <a:avLst/>
+                    </a:prstGeom>
+                  </pic:spPr>
+                </pic:pic>
+              </a:graphicData>
+            </a:graphic>
+          </wp:inline>
+        </w:drawing>
+      </w:r>
+    </w:p>
+    <w:p>
+      <w:r>
+        <w:t>Here are the console outputs:</w:t>
+      </w:r>
+    </w:p>
+    <w:p>
+      <w:r>
+        <w:rPr>
+          <w:noProof/>
+        </w:rPr>
+        <w:lastRenderedPageBreak/>
+        <w:drawing>
+          <wp:inline distT="0" distB="0" distL="0" distR="0" wp14:anchorId="44A2FD73" wp14:editId="3BE1F21B">
+            <wp:extent cx="5295900" cy="7858125"/>
+            <wp:effectExtent l="0" t="0" r="0" b="9525"/>
+            <wp:docPr id="842390932" name="Picture 1"/>
+            <wp:cNvGraphicFramePr>
+              <a:graphicFrameLocks xmlns:a="http://schemas.openxmlformats.org/drawingml/2006/main" noChangeAspect="1"/>
+            </wp:cNvGraphicFramePr>
+            <a:graphic xmlns:a="http://schemas.openxmlformats.org/drawingml/2006/main">
+              <a:graphicData uri="http://schemas.openxmlformats.org/drawingml/2006/picture">
+                <pic:pic xmlns:pic="http://schemas.openxmlformats.org/drawingml/2006/picture">
+                  <pic:nvPicPr>
+                    <pic:cNvPr id="842390932" name=""/>
+                    <pic:cNvPicPr/>
+                  </pic:nvPicPr>
+                  <pic:blipFill>
+                    <a:blip r:embed="rId32"/>
+                    <a:stretch>
+                      <a:fillRect/>
+                    </a:stretch>
+                  </pic:blipFill>
+                  <pic:spPr>
+                    <a:xfrm>
+                      <a:off x="0" y="0"/>
+                      <a:ext cx="5295900" cy="7858125"/>
                     </a:xfrm>
                     <a:prstGeom prst="rect">
                       <a:avLst/>

</xml_diff>